<commit_message>
waxaan soo commit gareeyey file kale
</commit_message>
<xml_diff>
--- a/جمهورية صوماليلاند.docx
+++ b/جمهورية صوماليلاند.docx
@@ -23,7 +23,6 @@
           <w:color w:val="EE0000"/>
         </w:rPr>
       </w:pPr>
-      <w:proofErr w:type="spellStart"/>
       <w:r>
         <w:rPr>
           <w:rFonts w:ascii="Arial" w:hAnsi="Arial" w:cs="Arial"/>
@@ -31,96 +30,21 @@
           <w:bCs/>
           <w:color w:val="EE0000"/>
         </w:rPr>
-        <w:t>جمهورية</w:t>
+        <w:t>جمهورية صوماليلاند | لجنة الحكم الراشد</w:t>
       </w:r>
-      <w:proofErr w:type="spellEnd"/>
+    </w:p>
+    <w:p>
+      <w:pPr>
+        <w:rPr>
+          <w:rFonts w:ascii="Arial" w:hAnsi="Arial" w:cs="Arial"/>
+        </w:rPr>
+      </w:pPr>
       <w:r>
         <w:rPr>
           <w:rFonts w:ascii="Arial" w:hAnsi="Arial" w:cs="Arial"/>
-          <w:b/>
-          <w:bCs/>
-          <w:color w:val="EE0000"/>
         </w:rPr>
-        <w:t xml:space="preserve"> </w:t>
+        <w:t>asasa</w:t>
       </w:r>
-      <w:proofErr w:type="spellStart"/>
-      <w:r>
-        <w:rPr>
-          <w:rFonts w:ascii="Arial" w:hAnsi="Arial" w:cs="Arial"/>
-          <w:b/>
-          <w:bCs/>
-          <w:color w:val="EE0000"/>
-        </w:rPr>
-        <w:t>صوماليلاند</w:t>
-      </w:r>
-      <w:proofErr w:type="spellEnd"/>
-      <w:r>
-        <w:rPr>
-          <w:rFonts w:ascii="Arial" w:hAnsi="Arial" w:cs="Arial"/>
-          <w:b/>
-          <w:bCs/>
-          <w:color w:val="EE0000"/>
-        </w:rPr>
-        <w:t xml:space="preserve"> | </w:t>
-      </w:r>
-      <w:proofErr w:type="spellStart"/>
-      <w:r>
-        <w:rPr>
-          <w:rFonts w:ascii="Arial" w:hAnsi="Arial" w:cs="Arial"/>
-          <w:b/>
-          <w:bCs/>
-          <w:color w:val="EE0000"/>
-        </w:rPr>
-        <w:t>لجنة</w:t>
-      </w:r>
-      <w:proofErr w:type="spellEnd"/>
-      <w:r>
-        <w:rPr>
-          <w:rFonts w:ascii="Arial" w:hAnsi="Arial" w:cs="Arial"/>
-          <w:b/>
-          <w:bCs/>
-          <w:color w:val="EE0000"/>
-        </w:rPr>
-        <w:t xml:space="preserve"> </w:t>
-      </w:r>
-      <w:proofErr w:type="spellStart"/>
-      <w:r>
-        <w:rPr>
-          <w:rFonts w:ascii="Arial" w:hAnsi="Arial" w:cs="Arial"/>
-          <w:b/>
-          <w:bCs/>
-          <w:color w:val="EE0000"/>
-        </w:rPr>
-        <w:t>الحكم</w:t>
-      </w:r>
-      <w:proofErr w:type="spellEnd"/>
-      <w:r>
-        <w:rPr>
-          <w:rFonts w:ascii="Arial" w:hAnsi="Arial" w:cs="Arial"/>
-          <w:b/>
-          <w:bCs/>
-          <w:color w:val="EE0000"/>
-        </w:rPr>
-        <w:t xml:space="preserve"> </w:t>
-      </w:r>
-      <w:proofErr w:type="spellStart"/>
-      <w:r>
-        <w:rPr>
-          <w:rFonts w:ascii="Arial" w:hAnsi="Arial" w:cs="Arial"/>
-          <w:b/>
-          <w:bCs/>
-          <w:color w:val="EE0000"/>
-        </w:rPr>
-        <w:t>الراشد</w:t>
-      </w:r>
-      <w:proofErr w:type="spellEnd"/>
-    </w:p>
-    <w:p>
-      <w:pPr>
-        <w:rPr>
-          <w:rFonts w:ascii="Arial" w:hAnsi="Arial" w:cs="Arial"/>
-        </w:rPr>
-      </w:pPr>
     </w:p>
     <w:sectPr>
       <w:pgSz w:w="11906" w:h="16838" w:code="9"/>

</xml_diff>